<commit_message>
Separa o Painel do Cliente em porta exclusiva com visual próprio
</commit_message>
<xml_diff>
--- a/docs/manual/Manual-do-Usuario-SERVITEC-VSA.docx
+++ b/docs/manual/Manual-do-Usuario-SERVITEC-VSA.docx
@@ -109,7 +109,7 @@
           <w:color w:val="009BB5"/>
           <w:sz w:val="20"/>
         </w:rPr>
-        <w:t>EDIÇÃO 1.0</w:t>
+        <w:t>EDIÇÃO 1.1</w:t>
       </w:r>
       <w:r>
         <w:rPr>
@@ -755,7 +755,7 @@
     </w:p>
     <w:p>
       <w:r>
-        <w:t>Edição do manual: 1.0 • 18 de outubro de 2026. Referência do código: revisão 577c433. A evolução da ferramenta poderá alterar telas e procedimentos.</w:t>
+        <w:t>Edição do manual: 1.1 • 18 de outubro de 2026. Referência funcional: Painel do Cliente em porta dedicada. A evolução da ferramenta poderá alterar telas e procedimentos.</w:t>
       </w:r>
     </w:p>
     <w:p>
@@ -1092,7 +1092,7 @@
           <w:b w:val="0"/>
           <w:color w:val="263449"/>
         </w:rPr>
-        <w:t>Abra a URL da plataforma no navegador e informe seu e-mail e senha. Clique em Entrar. A conta interna abre o Dashboard; a conta de cliente abre seu portal.</w:t>
+        <w:t>Abra a URL da plataforma no navegador e informe seu e-mail e senha. Clique em Entrar. A conta interna abre o Dashboard. Clientes utilizam o endereço exclusivo do Painel do Cliente, na porta 3001 por padrão; operadores continuam na porta interna configurada.</w:t>
       </w:r>
     </w:p>
     <w:p>
@@ -4288,7 +4288,7 @@
           <w:b w:val="0"/>
           <w:color w:val="263449"/>
         </w:rPr>
-        <w:t>Salve. Informe ao cliente a URL da plataforma e suas credenciais pelo canal habitual. O cadastro não envia e-mail automaticamente.</w:t>
+        <w:t>Salve. Informe ao cliente o endereço exclusivo exibido no cadastro de acessos e suas credenciais pelo canal habitual. A porta padrão do painel é 3001; a entrada interna é separada. O cadastro não envia e-mail automaticamente.</w:t>
       </w:r>
     </w:p>
     <w:p>
@@ -4437,7 +4437,7 @@
           <w:color w:val="58677B"/>
           <w:sz w:val="16"/>
         </w:rPr>
-        <w:t>Portal do cliente • indicadores e gráficos limitados à empresa autorizada.</w:t>
+        <w:t>Painel do Cliente • visual próprio e gráficos da empresa autorizada.</w:t>
       </w:r>
     </w:p>
     <w:p>
@@ -4457,7 +4457,7 @@
           <w:b w:val="0"/>
           <w:color w:val="263449"/>
         </w:rPr>
-        <w:t>Entre pelo mesmo endereço da plataforma, usando o e-mail e a senha recebidos. Confira o nome da sua empresa no portal.</w:t>
+        <w:t>Entre pelo endereço do Painel do Cliente informado pela equipe, usando o e-mail e a senha recebidos. Exemplo na rede local: http://IP-DO-SERVIDOR:3001. Confira o nome da sua empresa no portal.</w:t>
       </w:r>
     </w:p>
     <w:p>
@@ -4477,7 +4477,7 @@
           <w:b w:val="0"/>
           <w:color w:val="263449"/>
         </w:rPr>
-        <w:t>No Dashboard, acompanhe os totais e escolha o gráfico de barras ou disco, agrupado por mês, situação, modalidade ou prioridade.</w:t>
+        <w:t>Em Visão geral, acompanhe os totais e escolha o gráfico de barras ou disco, agrupado por mês, situação, modalidade ou prioridade.</w:t>
       </w:r>
     </w:p>
     <w:p>
@@ -6056,7 +6056,7 @@
     </w:p>
     <w:p>
       <w:r>
-        <w:t>Depois, entre na plataforma e pressione Ctrl+F5. Se a instalação usa outro diretório ou execução manual, ajuste o procedimento. O log do servidor fica normalmente em data\servidor.log.</w:t>
+        <w:t>Depois, pressione Ctrl+F5. Para liberar o painel padrão na LAN, execute liberar-painel-cliente.bat como administrador; ele reinicia a tarefa existente e libera a porta 3001 para a rede local. Se a instalação usa outro diretório ou execução manual, ajuste o procedimento. O log do servidor fica normalmente em data\servidor.log.</w:t>
       </w:r>
     </w:p>
     <w:p>
@@ -6327,7 +6327,7 @@
                 <w:color w:val="263449"/>
                 <w:sz w:val="18"/>
               </w:rPr>
-              <w:t>Perfil e permissões da conta. Cliente externo recebe apenas Dashboard e Meus chamados.</w:t>
+              <w:t>Perfil e permissões da conta. Cliente utiliza a porta própria do Painel do Cliente, com Visão geral e Meus chamados.</w:t>
             </w:r>
           </w:p>
         </w:tc>

</xml_diff>

<commit_message>
feat: ampliar gestão de TI com contratos SLA portal e segurança
</commit_message>
<xml_diff>
--- a/docs/manual/Manual-do-Usuario-SERVITEC-VSA.docx
+++ b/docs/manual/Manual-do-Usuario-SERVITEC-VSA.docx
@@ -109,7 +109,7 @@
           <w:color w:val="009BB5"/>
           <w:sz w:val="20"/>
         </w:rPr>
-        <w:t>EDIÇÃO 1.1</w:t>
+        <w:t>EDIÇÃO 1.2</w:t>
       </w:r>
       <w:r>
         <w:rPr>
@@ -680,6 +680,63 @@
           </w:p>
         </w:tc>
       </w:tr>
+      <w:tr>
+        <w:trPr>
+          <w:cantSplit/>
+        </w:trPr>
+        <w:tc>
+          <w:tcPr>
+            <w:tcW w:type="dxa" w:w="2891"/>
+            <w:tcMar>
+              <w:top w:w="100" w:type="dxa"/>
+              <w:left w:w="100" w:type="dxa"/>
+              <w:bottom w:w="100" w:type="dxa"/>
+              <w:right w:w="100" w:type="dxa"/>
+            </w:tcMar>
+            <w:vAlign w:val="center"/>
+            <w:shd w:fill="F1F5FA"/>
+          </w:tcPr>
+          <w:p>
+            <w:pPr>
+              <w:spacing w:after="20" w:line="252" w:lineRule="auto"/>
+            </w:pPr>
+            <w:r>
+              <w:rPr>
+                <w:b w:val="0"/>
+                <w:color w:val="263449"/>
+                <w:sz w:val="18"/>
+              </w:rPr>
+              <w:t>Complementos da versão 0.4.0</w:t>
+            </w:r>
+          </w:p>
+        </w:tc>
+        <w:tc>
+          <w:tcPr>
+            <w:tcW w:type="dxa" w:w="6633"/>
+            <w:tcMar>
+              <w:top w:w="100" w:type="dxa"/>
+              <w:left w:w="100" w:type="dxa"/>
+              <w:bottom w:w="100" w:type="dxa"/>
+              <w:right w:w="100" w:type="dxa"/>
+            </w:tcMar>
+            <w:vAlign w:val="center"/>
+            <w:shd w:fill="F1F5FA"/>
+          </w:tcPr>
+          <w:p>
+            <w:pPr>
+              <w:spacing w:after="20" w:line="252" w:lineRule="auto"/>
+            </w:pPr>
+            <w:r>
+              <w:rPr>
+                <w:b w:val="0"/>
+                <w:color w:val="263449"/>
+                <w:sz w:val="18"/>
+              </w:rPr>
+              <w:t>21–23</w:t>
+            </w:r>
+          </w:p>
+        </w:tc>
+      </w:tr>
     </w:tbl>
     <w:p>
       <w:pPr>
@@ -755,7 +812,7 @@
     </w:p>
     <w:p>
       <w:r>
-        <w:t>Edição do manual: 1.1 • 18 de outubro de 2026. Referência funcional: Painel do Cliente em porta dedicada. A evolução da ferramenta poderá alterar telas e procedimentos.</w:t>
+        <w:t>Edição do manual: 1.2 • 18 de outubro de 2026. Referência funcional: versão 0.4.0, com gestão de contratos e atendimento. Consulte também os capítulos complementares ao final. A evolução da ferramenta poderá alterar telas e procedimentos.</w:t>
       </w:r>
     </w:p>
     <w:p>
@@ -3265,7 +3322,7 @@
                 <w:color w:val="263449"/>
                 <w:sz w:val="18"/>
               </w:rPr>
-              <w:t>O agente coleta dados de inventário e recursos. O módulo Acesso remoto ainda indica integração pendente: esta versão não controla a tela nem executa comandos remotos. Serviços listados representam o último inventário, não um teste contínuo de disponibilidade.</w:t>
+              <w:t>O agente coleta dados de inventário e recursos. O módulo Acesso remoto registra autorização e abre o RustDesk instalado. O agente SERVITEC não controla a tela; o RustDesk exige instalação e configuração próprias. Serviços listados representam o último inventário, não um teste contínuo de disponibilidade.</w:t>
             </w:r>
           </w:p>
         </w:tc>
@@ -4354,7 +4411,7 @@
                 <w:color w:val="263449"/>
                 <w:sz w:val="18"/>
               </w:rPr>
-              <w:t>Várias pessoas podem ter acessos separados à mesma empresa. Cada conta de cliente consulta somente a empresa vinculada; seu perfil é fixo e somente de leitura. Revise a empresa selecionada antes de compartilhar o acesso.</w:t>
+              <w:t>Várias pessoas podem ter acessos separados à mesma empresa. Cada conta de cliente consulta somente a empresa vinculada; seu perfil pode consultar a empresa e, com liberação individual, abrir solicitações e responder. Revise a empresa selecionada antes de compartilhar o acesso.</w:t>
             </w:r>
           </w:p>
         </w:tc>
@@ -4530,7 +4587,7 @@
                 <w:color w:val="009BB5"/>
                 <w:sz w:val="18"/>
               </w:rPr>
-              <w:t>SOMENTE CONSULTA</w:t>
+              <w:t>ACESSO AUTORIZADO</w:t>
             </w:r>
           </w:p>
           <w:p>
@@ -4543,7 +4600,7 @@
                 <w:color w:val="263449"/>
                 <w:sz w:val="18"/>
               </w:rPr>
-              <w:t>O portal não permite abrir ou alterar chamados nem acessar inventário e administração. Os dados atualizam a cada 10 segundos com a aba visível. Minha senha permite trocar a própria senha. Se faltar um chamado, solicite à equipe que confira o vínculo dele com a empresa.</w:t>
+              <w:t>O portal permite abrir solicitações e responder somente quando a permissão individual estiver liberada. Não permite alterar status, registrar horas nem acessar inventário, custos ou administração. Os dados atualizam a cada 10 segundos com a aba visível. Minha senha permite trocar a própria senha. Se faltar um chamado, solicite à equipe que confira o vínculo dele com a empresa.</w:t>
             </w:r>
           </w:p>
         </w:tc>
@@ -6861,6 +6918,557 @@
         <w:spacing w:after="0"/>
       </w:pPr>
     </w:p>
+    <w:p>
+      <w:r>
+        <w:br w:type="page"/>
+      </w:r>
+    </w:p>
+    <w:p>
+      <w:r>
+        <w:rPr>
+          <w:b/>
+          <w:color w:val="009BB5"/>
+          <w:sz w:val="18"/>
+        </w:rPr>
+        <w:t>COMPLEMENTO / VERSÃO 0.4.0</w:t>
+      </w:r>
+    </w:p>
+    <w:p>
+      <w:pPr>
+        <w:pStyle w:val="Heading1"/>
+      </w:pPr>
+      <w:r>
+        <w:t>Contratos e atendimento completo</w:t>
+      </w:r>
+    </w:p>
+    <w:p>
+      <w:r>
+        <w:t>O menu Empresas e contratos centraliza contatos, unidades, responsável técnico e referências de documentação da empresa cliente. Selecione uma empresa cadastrada em Equipamentos para consultar seus chamados e equipamentos.</w:t>
+      </w:r>
+    </w:p>
+    <w:p>
+      <w:pPr>
+        <w:ind w:left="57"/>
+      </w:pPr>
+      <w:r>
+        <w:rPr>
+          <w:b/>
+          <w:color w:val="009BB5"/>
+          <w:sz w:val="20"/>
+        </w:rPr>
+        <w:t xml:space="preserve">01  </w:t>
+      </w:r>
+      <w:r>
+        <w:rPr>
+          <w:b w:val="0"/>
+          <w:color w:val="263449"/>
+        </w:rPr>
+        <w:t>Com a permissão Gerenciar contratos, SLA e preventivas, preencha mensalidade, horas inclusas e custo interno da hora.</w:t>
+      </w:r>
+    </w:p>
+    <w:p>
+      <w:pPr>
+        <w:ind w:left="57"/>
+      </w:pPr>
+      <w:r>
+        <w:rPr>
+          <w:b/>
+          <w:color w:val="009BB5"/>
+          <w:sz w:val="20"/>
+        </w:rPr>
+        <w:t xml:space="preserve">02  </w:t>
+      </w:r>
+      <w:r>
+        <w:rPr>
+          <w:b w:val="0"/>
+          <w:color w:val="263449"/>
+        </w:rPr>
+        <w:t>Ative o SLA e defina primeira resposta e solução, em minutos, para cada prioridade. Escolha calendário 24x7 ou segunda a sexta, com fuso e horário. Feriados especiais não são descontados.</w:t>
+      </w:r>
+    </w:p>
+    <w:p>
+      <w:pPr>
+        <w:ind w:left="57"/>
+      </w:pPr>
+      <w:r>
+        <w:rPr>
+          <w:b/>
+          <w:color w:val="009BB5"/>
+          <w:sz w:val="20"/>
+        </w:rPr>
+        <w:t xml:space="preserve">03  </w:t>
+      </w:r>
+      <w:r>
+        <w:rPr>
+          <w:b w:val="0"/>
+          <w:color w:val="263449"/>
+        </w:rPr>
+        <w:t>Nos chamados, use Histórico, conversa e horas. Escolha Nota interna ou Mensagem para o cliente; só a segunda aparece no portal.</w:t>
+      </w:r>
+    </w:p>
+    <w:p>
+      <w:pPr>
+        <w:ind w:left="57"/>
+      </w:pPr>
+      <w:r>
+        <w:rPr>
+          <w:b/>
+          <w:color w:val="009BB5"/>
+          <w:sz w:val="20"/>
+        </w:rPr>
+        <w:t xml:space="preserve">04  </w:t>
+      </w:r>
+      <w:r>
+        <w:rPr>
+          <w:b w:val="0"/>
+          <w:color w:val="263449"/>
+        </w:rPr>
+        <w:t>Anexe arquivos de até 512 KB, com limite total de 20 MB por chamado. Selecione explicitamente se o arquivo pode ser visto pelo cliente.</w:t>
+      </w:r>
+    </w:p>
+    <w:p>
+      <w:pPr>
+        <w:ind w:left="57"/>
+      </w:pPr>
+      <w:r>
+        <w:rPr>
+          <w:b/>
+          <w:color w:val="009BB5"/>
+          <w:sz w:val="20"/>
+        </w:rPr>
+        <w:t xml:space="preserve">05  </w:t>
+      </w:r>
+      <w:r>
+        <w:rPr>
+          <w:b w:val="0"/>
+          <w:color w:val="263449"/>
+        </w:rPr>
+        <w:t>Registre a data, o tempo em minutos, descrição e despesas do trabalho. O custo da hora é preservado em cada lançamento.</w:t>
+      </w:r>
+    </w:p>
+    <w:tbl>
+      <w:tblPr>
+        <w:tblW w:type="auto" w:w="0"/>
+        <w:tblLook w:firstColumn="1" w:firstRow="1" w:lastColumn="0" w:lastRow="0" w:noHBand="0" w:noVBand="1" w:val="04A0"/>
+      </w:tblPr>
+      <w:tblGrid>
+        <w:gridCol w:w="9524"/>
+      </w:tblGrid>
+      <w:tr>
+        <w:trPr>
+          <w:cantSplit/>
+        </w:trPr>
+        <w:tc>
+          <w:tcPr>
+            <w:tcW w:type="dxa" w:w="9524"/>
+            <w:shd w:fill="EFF7FB"/>
+            <w:tcMar>
+              <w:top w:w="135" w:type="dxa"/>
+              <w:left w:w="135" w:type="dxa"/>
+              <w:bottom w:w="135" w:type="dxa"/>
+              <w:right w:w="135" w:type="dxa"/>
+            </w:tcMar>
+          </w:tcPr>
+          <w:p>
+            <w:r>
+              <w:rPr>
+                <w:b/>
+                <w:color w:val="009BB5"/>
+                <w:sz w:val="18"/>
+              </w:rPr>
+              <w:t>PRAZOS E HISTÓRICO</w:t>
+            </w:r>
+          </w:p>
+          <w:p>
+            <w:pPr>
+              <w:spacing w:after="0"/>
+            </w:pPr>
+            <w:r>
+              <w:rPr>
+                <w:b w:val="0"/>
+                <w:color w:val="263449"/>
+                <w:sz w:val="18"/>
+              </w:rPr>
+              <w:t>O SLA vale para novos chamados e preserva as metas vigentes na criação. Alterar o contrato não recalcula o passado. Iniciar atendimento ou enviar resposta pública registra a primeira resposta. A reabertura mantém os prazos originais. Não há reconstrução de eventos anteriores à atualização.</w:t>
+            </w:r>
+          </w:p>
+        </w:tc>
+      </w:tr>
+    </w:tbl>
+    <w:p>
+      <w:pPr>
+        <w:spacing w:after="0"/>
+      </w:pPr>
+    </w:p>
+    <w:p>
+      <w:r>
+        <w:t>O menu Rentabilidade compara a mensalidade contratada atual com custos e despesas registrados no mês escolhido. É uma estimativa operacional; não representa faturamento efetivo, impostos ou um histórico contábil de mensalidades.</w:t>
+      </w:r>
+    </w:p>
+    <w:p>
+      <w:r>
+        <w:br w:type="page"/>
+      </w:r>
+    </w:p>
+    <w:p>
+      <w:r>
+        <w:rPr>
+          <w:b/>
+          <w:color w:val="009BB5"/>
+          <w:sz w:val="18"/>
+        </w:rPr>
+        <w:t>COMPLEMENTO / VERSÃO 0.4.0</w:t>
+      </w:r>
+    </w:p>
+    <w:p>
+      <w:pPr>
+        <w:pStyle w:val="Heading1"/>
+      </w:pPr>
+      <w:r>
+        <w:t>Portal, e-mails e rotina de operação</w:t>
+      </w:r>
+    </w:p>
+    <w:p>
+      <w:pPr>
+        <w:ind w:left="57"/>
+      </w:pPr>
+      <w:r>
+        <w:rPr>
+          <w:b/>
+          <w:color w:val="009BB5"/>
+          <w:sz w:val="20"/>
+        </w:rPr>
+        <w:t xml:space="preserve">01  </w:t>
+      </w:r>
+      <w:r>
+        <w:rPr>
+          <w:b w:val="0"/>
+          <w:color w:val="263449"/>
+        </w:rPr>
+        <w:t>Em Acessos de clientes, edite a pessoa e marque Permitir abrir chamados e responder mensagens quando autorizado. Acessos existentes permanecem de consulta até a liberação.</w:t>
+      </w:r>
+    </w:p>
+    <w:p>
+      <w:pPr>
+        <w:ind w:left="57"/>
+      </w:pPr>
+      <w:r>
+        <w:rPr>
+          <w:b/>
+          <w:color w:val="009BB5"/>
+          <w:sz w:val="20"/>
+        </w:rPr>
+        <w:t xml:space="preserve">02  </w:t>
+      </w:r>
+      <w:r>
+        <w:rPr>
+          <w:b w:val="0"/>
+          <w:color w:val="263449"/>
+        </w:rPr>
+        <w:t>No portal, o cliente usa Abrir solicitação e acompanha apenas os chamados e as conversas públicas da empresa vinculada. Não atua como operador.</w:t>
+      </w:r>
+    </w:p>
+    <w:p>
+      <w:pPr>
+        <w:ind w:left="57"/>
+      </w:pPr>
+      <w:r>
+        <w:rPr>
+          <w:b/>
+          <w:color w:val="009BB5"/>
+          <w:sz w:val="20"/>
+        </w:rPr>
+        <w:t xml:space="preserve">03  </w:t>
+      </w:r>
+      <w:r>
+        <w:rPr>
+          <w:b w:val="0"/>
+          <w:color w:val="263449"/>
+        </w:rPr>
+        <w:t>Em Configurações → E-mail, ative separadamente o envio SMTP para confirmações e mensagens públicas. O padrão é desativado; exige senha de app e permissão do Google Workspace para smtp.gmail.com:465.</w:t>
+      </w:r>
+    </w:p>
+    <w:p>
+      <w:pPr>
+        <w:ind w:left="57"/>
+      </w:pPr>
+      <w:r>
+        <w:rPr>
+          <w:b/>
+          <w:color w:val="009BB5"/>
+          <w:sz w:val="20"/>
+        </w:rPr>
+        <w:t xml:space="preserve">04  </w:t>
+      </w:r>
+      <w:r>
+        <w:rPr>
+          <w:b w:val="0"/>
+          <w:color w:val="263449"/>
+        </w:rPr>
+        <w:t>Consulte a fila SMTP nessa configuração. Em falha ambígua, confira Enviados antes de reenviar manualmente; o sistema não repete automaticamente uma entrega incerta.</w:t>
+      </w:r>
+    </w:p>
+    <w:p>
+      <w:pPr>
+        <w:ind w:left="57"/>
+      </w:pPr>
+      <w:r>
+        <w:rPr>
+          <w:b/>
+          <w:color w:val="009BB5"/>
+          <w:sz w:val="20"/>
+        </w:rPr>
+        <w:t xml:space="preserve">05  </w:t>
+      </w:r>
+      <w:r>
+        <w:rPr>
+          <w:b w:val="0"/>
+          <w:color w:val="263449"/>
+        </w:rPr>
+        <w:t>Em Preventivas, cadastre atividade, empresa, intervalo em dias e próxima data. Cada ocorrência abre um chamado, com proteção contra duplicação. Pausar e retomar fica disponível no plano.</w:t>
+      </w:r>
+    </w:p>
+    <w:tbl>
+      <w:tblPr>
+        <w:tblW w:type="auto" w:w="0"/>
+        <w:tblLook w:firstColumn="1" w:firstRow="1" w:lastColumn="0" w:lastRow="0" w:noHBand="0" w:noVBand="1" w:val="04A0"/>
+      </w:tblPr>
+      <w:tblGrid>
+        <w:gridCol w:w="9524"/>
+      </w:tblGrid>
+      <w:tr>
+        <w:trPr>
+          <w:cantSplit/>
+        </w:trPr>
+        <w:tc>
+          <w:tcPr>
+            <w:tcW w:type="dxa" w:w="9524"/>
+            <w:shd w:fill="EFF7FB"/>
+            <w:tcMar>
+              <w:top w:w="135" w:type="dxa"/>
+              <w:left w:w="135" w:type="dxa"/>
+              <w:bottom w:w="135" w:type="dxa"/>
+              <w:right w:w="135" w:type="dxa"/>
+            </w:tcMar>
+          </w:tcPr>
+          <w:p>
+            <w:r>
+              <w:rPr>
+                <w:b/>
+                <w:color w:val="009BB5"/>
+                <w:sz w:val="18"/>
+              </w:rPr>
+              <w:t>CONVERSAS POR E-MAIL</w:t>
+            </w:r>
+          </w:p>
+          <w:p>
+            <w:pPr>
+              <w:spacing w:after="0"/>
+            </w:pPr>
+            <w:r>
+              <w:rPr>
+                <w:b w:val="0"/>
+                <w:color w:val="263449"/>
+                <w:sz w:val="18"/>
+              </w:rPr>
+              <w:t>Respostas com In-Reply-To ou References podem entrar no chamado existente quando o remetente está aprovado para a mesma empresa. O número do protocolo no assunto, sozinho, não vincula mensagens. Os anexos MIME permanecem na caixa original.</w:t>
+            </w:r>
+          </w:p>
+        </w:tc>
+      </w:tr>
+    </w:tbl>
+    <w:p>
+      <w:pPr>
+        <w:spacing w:after="0"/>
+      </w:pPr>
+    </w:p>
+    <w:p>
+      <w:r>
+        <w:t>Alertas persistentes incluem ausência de comunicação por mais de 5 minutos e CPU, RAM ou disco acima de 90% por pelo menos 2 minutos observados. O menu também reúne SLAs vencidos. Os alertas não criam chamados automaticamente. A verificação ocorre enquanto o servidor está ligado.</w:t>
+      </w:r>
+    </w:p>
+    <w:p>
+      <w:r>
+        <w:br w:type="page"/>
+      </w:r>
+    </w:p>
+    <w:p>
+      <w:r>
+        <w:rPr>
+          <w:b/>
+          <w:color w:val="009BB5"/>
+          <w:sz w:val="18"/>
+        </w:rPr>
+        <w:t>COMPLEMENTO / VERSÃO 0.4.0</w:t>
+      </w:r>
+    </w:p>
+    <w:p>
+      <w:pPr>
+        <w:pStyle w:val="Heading1"/>
+      </w:pPr>
+      <w:r>
+        <w:t>Segurança, acesso remoto e recuperação</w:t>
+      </w:r>
+    </w:p>
+    <w:p>
+      <w:pPr>
+        <w:ind w:left="57"/>
+      </w:pPr>
+      <w:r>
+        <w:rPr>
+          <w:b/>
+          <w:color w:val="009BB5"/>
+          <w:sz w:val="20"/>
+        </w:rPr>
+        <w:t xml:space="preserve">01  </w:t>
+      </w:r>
+      <w:r>
+        <w:rPr>
+          <w:b w:val="0"/>
+          <w:color w:val="263449"/>
+        </w:rPr>
+        <w:t>Em Segurança da conta, informe a senha e prepare o autenticador. Adicione a chave no Google Authenticator ou Microsoft Authenticator e confirme o código. Guarde os oito códigos de recuperação fora do sistema; cada um funciona uma vez.</w:t>
+      </w:r>
+    </w:p>
+    <w:p>
+      <w:pPr>
+        <w:ind w:left="57"/>
+      </w:pPr>
+      <w:r>
+        <w:rPr>
+          <w:b/>
+          <w:color w:val="009BB5"/>
+          <w:sz w:val="20"/>
+        </w:rPr>
+        <w:t xml:space="preserve">02  </w:t>
+      </w:r>
+      <w:r>
+        <w:rPr>
+          <w:b w:val="0"/>
+          <w:color w:val="263449"/>
+        </w:rPr>
+        <w:t>No login seguinte, informe senha e código. Um código TOTP já usado não pode ser reutilizado; espere o próximo para uma operação sensível. Clientes encontram essa configuração em Minha senha.</w:t>
+      </w:r>
+    </w:p>
+    <w:p>
+      <w:pPr>
+        <w:ind w:left="57"/>
+      </w:pPr>
+      <w:r>
+        <w:rPr>
+          <w:b/>
+          <w:color w:val="009BB5"/>
+          <w:sz w:val="20"/>
+        </w:rPr>
+        <w:t xml:space="preserve">03  </w:t>
+      </w:r>
+      <w:r>
+        <w:rPr>
+          <w:b w:val="0"/>
+          <w:color w:val="263449"/>
+        </w:rPr>
+        <w:t>O Cofre exige permissão específica. Cadastre credenciais por empresa; revelar exige senha e segundo fator quando habilitado, registra auditoria e oculta o segredo após 60 segundos.</w:t>
+      </w:r>
+    </w:p>
+    <w:p>
+      <w:pPr>
+        <w:ind w:left="57"/>
+      </w:pPr>
+      <w:r>
+        <w:rPr>
+          <w:b/>
+          <w:color w:val="009BB5"/>
+          <w:sz w:val="20"/>
+        </w:rPr>
+        <w:t xml:space="preserve">04  </w:t>
+      </w:r>
+      <w:r>
+        <w:rPr>
+          <w:b w:val="0"/>
+          <w:color w:val="263449"/>
+        </w:rPr>
+        <w:t>Para Acesso remoto, instale e configure RustDesk nas máquinas. No sistema, selecione equipamento e informe ID, motivo e autorização. O botão abre o aplicativo instalado; o registro não confirma conexão nem grava tela.</w:t>
+      </w:r>
+    </w:p>
+    <w:p>
+      <w:pPr>
+        <w:ind w:left="57"/>
+      </w:pPr>
+      <w:r>
+        <w:rPr>
+          <w:b/>
+          <w:color w:val="009BB5"/>
+          <w:sz w:val="20"/>
+        </w:rPr>
+        <w:t xml:space="preserve">05  </w:t>
+      </w:r>
+      <w:r>
+        <w:rPr>
+          <w:b w:val="0"/>
+          <w:color w:val="263449"/>
+        </w:rPr>
+        <w:t>Em Configurações → Backups, consulte o número da cópia e use Verificar arquivos e banco. O sistema compara hashes e testa a integridade do SQLite, sem iniciar a instalação restaurada.</w:t>
+      </w:r>
+    </w:p>
+    <w:tbl>
+      <w:tblPr>
+        <w:tblW w:type="auto" w:w="0"/>
+        <w:tblLook w:firstColumn="1" w:firstRow="1" w:lastColumn="0" w:lastRow="0" w:noHBand="0" w:noVBand="1" w:val="04A0"/>
+      </w:tblPr>
+      <w:tblGrid>
+        <w:gridCol w:w="9524"/>
+      </w:tblGrid>
+      <w:tr>
+        <w:trPr>
+          <w:cantSplit/>
+        </w:trPr>
+        <w:tc>
+          <w:tcPr>
+            <w:tcW w:type="dxa" w:w="9524"/>
+            <w:shd w:fill="EFF7FB"/>
+            <w:tcMar>
+              <w:top w:w="135" w:type="dxa"/>
+              <w:left w:w="135" w:type="dxa"/>
+              <w:bottom w:w="135" w:type="dxa"/>
+              <w:right w:w="135" w:type="dxa"/>
+            </w:tcMar>
+          </w:tcPr>
+          <w:p>
+            <w:r>
+              <w:rPr>
+                <w:b/>
+                <w:color w:val="009BB5"/>
+                <w:sz w:val="18"/>
+              </w:rPr>
+              <w:t>APÓS RESTAURAR</w:t>
+            </w:r>
+          </w:p>
+          <w:p>
+            <w:pPr>
+              <w:spacing w:after="0"/>
+            </w:pPr>
+            <w:r>
+              <w:rPr>
+                <w:b w:val="0"/>
+                <w:color w:val="263449"/>
+                <w:sz w:val="18"/>
+              </w:rPr>
+              <w:t>Instale dependências com npm ci. E-mails e automações de alertas/preventivas ficam pausados na cópia; envios pendentes são cancelados e sessões removidas. Revise tudo antes de reativar. A chave data/security.key precisa acompanhar o banco para recuperar TOTP e o cofre.</w:t>
+            </w:r>
+          </w:p>
+        </w:tc>
+      </w:tr>
+    </w:tbl>
+    <w:p>
+      <w:pPr>
+        <w:spacing w:after="0"/>
+      </w:pPr>
+    </w:p>
+    <w:p>
+      <w:r>
+        <w:t>O guia docs/melhorias-v0.4.0.md detalha atualização no Windows Server, permissões, limites e ensaio isolado de recuperação. Gmail real, RustDesk, firewall e HTTPS exigem configuração na sua infraestrutura.</w:t>
+      </w:r>
+    </w:p>
     <w:sectPr>
       <w:headerReference w:type="default" r:id="rId9"/>
       <w:footerReference w:type="default" r:id="rId10"/>

</xml_diff>

<commit_message>
feat: calcular contratos por quantidade e preço de equipamentos
</commit_message>
<xml_diff>
--- a/docs/manual/Manual-do-Usuario-SERVITEC-VSA.docx
+++ b/docs/manual/Manual-do-Usuario-SERVITEC-VSA.docx
@@ -6963,7 +6963,7 @@
           <w:b w:val="0"/>
           <w:color w:val="263449"/>
         </w:rPr>
-        <w:t>Com a permissão Gerenciar contratos, SLA e preventivas, preencha mensalidade, horas inclusas e custo interno da hora.</w:t>
+        <w:t>Com a permissão Gerenciar contratos, SLA e preventivas, preencha quantidades contratadas de computadores, notebooks e servidores. Os padrões são R$ 90,00 por computador/notebook e R$ 300,00 por servidor ao mês. Ajuste preços por complexidade, registrando justificativa. A mensalidade é calculada automaticamente. Defina também, se desejar, horas previstas para acompanhamento e custo interno da hora. Esses campos medem a rentabilidade e não determinam a cobrança.</w:t>
       </w:r>
     </w:p>
     <w:p>
@@ -7089,7 +7089,7 @@
                 <w:color w:val="263449"/>
                 <w:sz w:val="18"/>
               </w:rPr>
-              <w:t>O SLA vale para novos chamados e preserva as metas vigentes na criação. Alterar o contrato não recalcula o passado. Iniciar atendimento ou enviar resposta pública registra a primeira resposta. A reabertura mantém os prazos originais. Não há reconstrução de eventos anteriores à atualização.</w:t>
+              <w:t>A cobrança usa quantidades contratadas, sem alterações automáticas pelo inventário. Valores fixos antigos são preservados até a conversão explícita. O SLA vale para novos chamados e preserva as metas vigentes na criação. Alterar o contrato não recalcula o passado. Iniciar atendimento ou enviar resposta pública registra a primeira resposta. A reabertura mantém os prazos originais. Não há reconstrução de eventos anteriores à atualização.</w:t>
             </w:r>
           </w:p>
         </w:tc>

</xml_diff>

<commit_message>
feat: adicionar aplicativo e atalhos de abertura de chamados ao agente
</commit_message>
<xml_diff>
--- a/docs/manual/Manual-do-Usuario-SERVITEC-VSA.docx
+++ b/docs/manual/Manual-do-Usuario-SERVITEC-VSA.docx
@@ -2407,6 +2407,11 @@
           <w:color w:val="263449"/>
         </w:rPr>
         <w:t>Volte a Monitoramento e aguarde os primeiros dados. A coleta inicial completa pode levar alguns minutos.</w:t>
+      </w:r>
+    </w:p>
+    <w:p>
+      <w:r>
+        <w:t>Na instalação 0.4.2, informe também a URL do Painel do Cliente para criar SERVITEC VSA — Abrir chamado na Área de Trabalho e no menu Iniciar. O aplicativo abre uma janela pelo Edge/Chrome e exige a conta do cliente com permissão de abrir solicitações. Em PCs já instalados, execute novamente o novo instalador. ENTER ignora a criação ou alteração do atalho.</w:t>
       </w:r>
     </w:p>
     <w:tbl>

</xml_diff>

<commit_message>
feat: organizar módulos em submenus e cadastros em abas
</commit_message>
<xml_diff>
--- a/docs/manual/Manual-do-Usuario-SERVITEC-VSA.docx
+++ b/docs/manual/Manual-do-Usuario-SERVITEC-VSA.docx
@@ -1169,7 +1169,7 @@
           <w:b w:val="0"/>
           <w:color w:val="263449"/>
         </w:rPr>
-        <w:t>Use os itens do menu à esquerda, posicionado no alto, para alternar entre os módulos autorizados. Em telas menores, a organização se adapta ao espaço.</w:t>
+        <w:t>Use o menu à esquerda, posicionado no alto: expanda Atendimento, Clientes, Infraestrutura, Gestão ou Administração e escolha o módulo autorizado. O Dashboard permanece direto no menu. Em telas menores, a organização se adapta ao espaço.</w:t>
       </w:r>
     </w:p>
     <w:p>
@@ -6948,7 +6948,7 @@
     </w:p>
     <w:p>
       <w:r>
-        <w:t>O menu Empresas e contratos centraliza contatos, unidades, responsável técnico e referências de documentação da empresa cliente. Selecione uma empresa cadastrada em Equipamentos para consultar seus chamados e equipamentos.</w:t>
+        <w:t>Em Clientes → Empresas e contratos, use as abas Dados da empresa, Unidades e documentação, Contrato e equipamentos e SLA e atendimento. Alternar abas preserva os campos; Salvar todas as alterações salva tudo em conjunto e mantém a aba selecionada. A ficha centraliza contatos, unidades, responsável técnico e documentação. Selecione uma empresa cadastrada em Equipamentos para consultar seus chamados e equipamentos.</w:t>
       </w:r>
     </w:p>
     <w:p>
@@ -7008,7 +7008,7 @@
           <w:b w:val="0"/>
           <w:color w:val="263449"/>
         </w:rPr>
-        <w:t>Nos chamados, use Histórico, conversa e horas. Escolha Nota interna ou Mensagem para o cliente; só a segunda aparece no portal.</w:t>
+        <w:t>Nos chamados, use Histórico, conversa e horas e alterne as abas Histórico, Mensagens e notas, Anexos e Horas e despesas. Cada formulário tem seu salvamento. Escolha Nota interna ou Mensagem para o cliente; só a segunda aparece no portal.</w:t>
       </w:r>
     </w:p>
     <w:p>

</xml_diff>

<commit_message>
feat: dividir cadastros e listas em páginas curtas
</commit_message>
<xml_diff>
--- a/docs/manual/Manual-do-Usuario-SERVITEC-VSA.docx
+++ b/docs/manual/Manual-do-Usuario-SERVITEC-VSA.docx
@@ -6948,7 +6948,7 @@
     </w:p>
     <w:p>
       <w:r>
-        <w:t>Em Clientes → Empresas e contratos, use as abas Dados da empresa, Unidades e documentação, Contrato e equipamentos e SLA e atendimento. Alternar abas preserva os campos; Salvar todas as alterações salva tudo em conjunto e mantém a aba selecionada. A ficha centraliza contatos, unidades, responsável técnico e documentação. Selecione uma empresa cadastrada em Equipamentos para consultar seus chamados e equipamentos.</w:t>
+        <w:t>Em Clientes → Empresas e contratos, use páginas curtas com Anterior, Próximo e seletor de página. As etapas separam dados, contatos, unidades, documentos, contrato, quantidades, valores, horário e metas. Alternar páginas preserva os campos; Salvar todas as alterações salva tudo e mantém a página selecionada. A ficha centraliza contatos, unidades, responsável técnico e documentação. Selecione uma empresa cadastrada em Equipamentos para consultar seus chamados e equipamentos.</w:t>
       </w:r>
     </w:p>
     <w:p>
@@ -7008,7 +7008,7 @@
           <w:b w:val="0"/>
           <w:color w:val="263449"/>
         </w:rPr>
-        <w:t>Nos chamados, use Histórico, conversa e horas e alterne as abas Histórico, Mensagens e notas, Anexos e Horas e despesas. Cada formulário tem seu salvamento. Escolha Nota interna ou Mensagem para o cliente; só a segunda aparece no portal.</w:t>
+        <w:t>Nos chamados, use Histórico, conversa e horas e alterne as páginas Histórico, Mensagens e notas, Anexos e Horas e despesas pelo seletor ou pelos botões Anterior e Próximo. Cada formulário tem seu salvamento. Escolha Nota interna ou Mensagem para o cliente; só a segunda aparece no portal.</w:t>
       </w:r>
     </w:p>
     <w:p>

</xml_diff>